<commit_message>
Novo titulo, quadro da Metodologia, artigo/Mostra sem resultados; salva edicao da Paola
- Titulo oficial aplicado no artigo, deck, roteiro de estudo e Mostra
- Quadro "Sintese do protocolo aplicado" (Etapa/Periodo/Recurso/Frequencia/Como foi feito)
  no artigo, deck e Mostra (Resumo Expandido + slide)
- Artigo/Mostra: removidos resumo, resultados e conclusao (aguardam fotos do depois);
  antecedente 2023/2024; geradores com quadro tracejado para fotos ausentes
- Mostra: preserva a edicao da Paola na apresentacao (topicos da Metodologia movidos para a
  Introducao; slide do quadro no lugar da Metodologia) e o gerador passa a reproduzi-la
- Copias de seguranca das versoes anteriores em _guardado/

Co-Authored-By: Claude Sonnet 5.5 <noreply@anthropic.com>
</commit_message>
<xml_diff>
--- a/resultados finais/mostra-cientifica-2026/Mostra-Cientifica-2026-Resumo-Expandido-AAF-H-pylori.docx
+++ b/resultados finais/mostra-cientifica-2026/Mostra-Cientifica-2026-Resumo-Expandido-AAF-H-pylori.docx
@@ -17,7 +17,7 @@
           <w:b/>
           <w:bCs/>
         </w:rPr>
-        <w:t xml:space="preserve">ALOPECIA ANDROGENÉTICA FEMININA E SAÚDE GASTROINTESTINAL: ESTUDO DE CASO DE PROTOCOLO COM FOTOBIOMODULAÇÃO, INTRADERMOTERAPIA E CUIDADO DOMICILIAR</w:t>
+        <w:t xml:space="preserve">ALOPECIA ANDROGENÉTICA FEMININA E SAÚDE GASTROINTESTINAL: ESTUDO DE CASO DE UM PROTOCOLO ESTÉTICO COM FOTOBIOMODULAÇÃO, INTRADERMOTERAPIA CAPILAR E CUIDADO DOMICILIAR</w:t>
       </w:r>
     </w:p>
     <w:p>
@@ -95,7 +95,7 @@
       </w:pPr>
       <w:r>
         <w:rPr/>
-        <w:t xml:space="preserve">A alopecia androgenética feminina é disfunção capilar crônica, progressiva e multifatorial, de base genética e hormonal, cuja progressão pode ser modulada por fatores sistêmicos, entre eles alterações gastrointestinais que comprometem a absorção de micronutrientes essenciais ao ciclo capilar. Este resumo expandido descreve e discute um protocolo estético aplicado a paciente de 61 anos com alopecia androgenética, gastrite crônica e histórico de infecção por </w:t>
+        <w:t xml:space="preserve">A alopecia androgenética feminina é disfunção capilar crônica, progressiva e multifatorial, de base genética e hormonal, cuja progressão pode ser modulada por fatores sistêmicos, entre eles alterações gastrointestinais que comprometem a absorção de micronutrientes essenciais ao ciclo capilar. Este resumo expandido descreve um protocolo estético aplicado a paciente com alopecia androgenética, gastrite crônica e histórico de infecção por </w:t>
       </w:r>
       <w:r>
         <w:rPr>
@@ -106,7 +106,7 @@
       </w:r>
       <w:r>
         <w:rPr/>
-        <w:t xml:space="preserve"> já erradicada. Trata-se de estudo de caso descritivo e qualitativo, em andamento, conduzido por anamnese capilar, tricoscopia e registro fotográfico padronizado, associando fotobiomodulação, intradermoterapia capilar e cuidado domiciliar. Como resultados parciais, observaram-se melhora da condição do couro cabeludo e surgimento de novos fios nas áreas rarefeitas, após fase de piora atribuída à baixa adesão domiciliar e corrigida por reavaliação, ajuste da higienização e apoio médico ao quadro gastrointestinal, discutido como fator associado e coadjuvante, nunca como causa da alopecia.</w:t>
+        <w:t xml:space="preserve"> já erradicada. Trata-se de estudo de caso descritivo e qualitativo, em andamento, conduzido por anamnese capilar, tricoscopia e registro fotográfico padronizado, associando fotobiomodulação, intradermoterapia capilar e cuidado domiciliar, iniciados em 2024, após tratamento prévio de desinflamação (2023) e cura da infecção. Os resultados ainda não foram analisados, pois dependem do registro fotográfico final; a condição gastrointestinal é discutida como fator associado, nunca como causa da alopecia.</w:t>
       </w:r>
     </w:p>
     <w:p>
@@ -190,7 +190,7 @@
       </w:r>
       <w:r>
         <w:rPr/>
-        <w:t xml:space="preserve"> e a instalação da alopecia. A literatura disponível permite sustentar apenas a existência de fatores associados e de mecanismos compartilhados plausíveis — sobretudo a má absorção de micronutrientes essenciais ao folículo —, e é nessa condição de fator coadjuvante, e não de causa, que a condição gastrointestinal é aqui discutida. Registra-se também que se trata de pesquisa em andamento, cujos achados são apresentados como resultados parciais.</w:t>
+        <w:t xml:space="preserve"> e a instalação da alopecia. A literatura disponível permite sustentar apenas a existência de fatores associados e de mecanismos compartilhados plausíveis — sobretudo a má absorção de micronutrientes essenciais ao folículo —, e é nessa condição de fator coadjuvante, e não de causa, que a condição gastrointestinal é aqui discutida. Registra-se também que se trata de pesquisa em andamento, cujos resultados dependem do registro fotográfico final.</w:t>
       </w:r>
     </w:p>
     <w:p>
@@ -201,7 +201,7 @@
       </w:pPr>
       <w:r>
         <w:rPr/>
-        <w:t xml:space="preserve">O objetivo geral deste trabalho é descrever e discutir os resultados de um protocolo estético fundamentado em fotobiomodulação, intradermoterapia capilar e cuidado domiciliar, conduzido em paralelo ao acompanhamento médico, para o controle da miniaturização folicular e a melhora da qualidade capilar da paciente. Como objetivos específicos, buscou-se descrever a fisiopatologia da AAF, apresentar o diagnóstico estético-funcional obtido por tricoscopia, fundamentar cientificamente os recursos empregados e relatar de forma honesta a evolução clínica, incluindo os períodos de resposta insatisfatória e seus prováveis determinantes.</w:t>
+        <w:t xml:space="preserve">O objetivo geral deste trabalho é descrever um protocolo estético fundamentado em fotobiomodulação, intradermoterapia capilar e cuidado domiciliar, conduzido em paralelo ao acompanhamento médico, para o controle da miniaturização folicular da paciente. Como objetivos específicos, buscou-se descrever a fisiopatologia da AAF, apresentar o diagnóstico estético-funcional obtido por tricoscopia, fundamentar cientificamente os recursos empregados e descrever o protocolo aplicado.</w:t>
       </w:r>
     </w:p>
     <w:p>
@@ -274,18 +274,18 @@
       </w:pPr>
       <w:r>
         <w:rPr/>
-        <w:t xml:space="preserve">O protocolo foi conduzido em duas fases sequenciais, respeitando a lógica fisiológica de desinflamar antes de estimular. A Fase 1, de desinflamação, empregou aromaterapia com óleos essenciais, argiloterapia e fotobiomodulação com luz azul para o controle da inflamação e da oleosidade. A Fase 2, de estímulo, associou intradermoterapia capilar pela técnica de pápula, fotobiomodulação com luz vermelha e manutenção domiciliar. Na intradermoterapia, aplicou-se a Mescla PHD — Minoxidil 8 mg, Nanofatores de Crescimento Capilar 1%, Latanoprosta 50 mcg, Pill Food e Lidocaína 20 mg — por microinjeções na junção dermoepidérmica, em profundidade de 2 a 4 mm, com agulha 30G, depositando cerca de 0,05 a 0,1 mL por ponto, em pápulas espaçadas a cada 2 cm. A fotobiomodulação foi realizada em sessões de aproximadamente 20 minutos, com parâmetros conferidos no manual do equipamento. Em domicílio, manteve-se o uso contínuo de tônico capilar à base de </w:t>
+        <w:t xml:space="preserve">Antecedente terapêutico: em 2023, a paciente realizou, por conta da alopecia androgenética, um tratamento prévio de desinflamação do couro cabeludo, que não integra o protocolo aqui descrito e não foi conduzido pela autora. Alguns meses depois, notou piora do quadro; a investigação identificou infecção por </w:t>
       </w:r>
       <w:r>
         <w:rPr>
           <w:i/>
           <w:iCs/>
         </w:rPr>
-        <w:t xml:space="preserve">Capilia Longa</w:t>
-      </w:r>
-      <w:r>
-        <w:rPr/>
-        <w:t xml:space="preserve">.</w:t>
+        <w:t xml:space="preserve">Helicobacter pylori</w:t>
+      </w:r>
+      <w:r>
+        <w:rPr/>
+        <w:t xml:space="preserve"> e gastrite, tratada a infecção com antibioticoterapia, com cura, e a gastrite permaneceu. Diante da piora e da miniaturização folicular mais acelerada, em 2024 optou-se por uma estimulação mais intensa da região, por meio de recursos mais invasivos.</w:t>
       </w:r>
     </w:p>
     <w:p>
@@ -296,7 +296,18 @@
       </w:pPr>
       <w:r>
         <w:rPr/>
-        <w:t xml:space="preserve">O acompanhamento seguiu uma linha do tempo definida. No terceiro semestre do curso iniciou-se a terapia capilar como preparo da pele, primeiro passo do protocolo, com foco em home care, isto é, na instrução e no acompanhamento dos cuidados domiciliares. Neste ano, constatou-se piora do quadro, o que motivou uma nova avaliação da paciente. A partir dessa reavaliação, houve melhora dos hábitos domésticos — higienização e lavagem capilar mais frequentes e adequadas —, em conjunto com o apoio médico que contribuiu para a melhora do quadro gastrointestinal. Essa sequência (preparo e home care no terceiro semestre, piora, reavaliação, correção de hábitos e apoio médico) organiza a leitura dos resultados parciais apresentados a seguir.</w:t>
+        <w:t xml:space="preserve">O protocolo aplicado pela autora consistiu em uma única etapa de estímulo, que associou intradermoterapia capilar pela técnica de pápula, fotobiomodulação com luz vermelha e manutenção domiciliar. Na intradermoterapia, aplicou-se a Mescla PHD — Minoxidil 8 mg, Nanofatores de Crescimento Capilar 1%, Latanoprosta 50 mcg, Pill Food e Lidocaína 20 mg — por microinjeções na junção dermoepidérmica, em profundidade de 2 a 4 mm, com agulha 30G, depositando cerca de 0,05 a 0,1 mL por ponto, em pápulas espaçadas a cada 2 cm. A fotobiomodulação foi realizada em sessões de aproximadamente 20 minutos, com parâmetros conferidos no manual do equipamento. Em domicílio, manteve-se o uso contínuo de tônico capilar à base de </w:t>
+      </w:r>
+      <w:r>
+        <w:rPr>
+          <w:i/>
+          <w:iCs/>
+        </w:rPr>
+        <w:t xml:space="preserve">Capilia Longa</w:t>
+      </w:r>
+      <w:r>
+        <w:rPr/>
+        <w:t xml:space="preserve">.</w:t>
       </w:r>
     </w:p>
     <w:p>
@@ -312,6 +323,528 @@
     </w:p>
     <w:p>
       <w:pPr>
+        <w:spacing w:before="60" w:after="60" w:line="240" w:lineRule="auto"/>
+        <w:jc w:val="left"/>
+      </w:pPr>
+      <w:r>
+        <w:rPr>
+          <w:b/>
+          <w:bCs/>
+        </w:rPr>
+        <w:t xml:space="preserve">Quadro 1 – Síntese do protocolo aplicado</w:t>
+      </w:r>
+    </w:p>
+    <w:tbl>
+      <w:tblPr>
+        <w:tblW w:w="9071" w:type="dxa"/>
+        <w:tblBorders>
+          <w:top w:val="single" w:sz="4" w:space="0" w:color="808080"/>
+          <w:left w:val="single" w:sz="4" w:space="0" w:color="808080"/>
+          <w:bottom w:val="single" w:sz="4" w:space="0" w:color="808080"/>
+          <w:right w:val="single" w:sz="4" w:space="0" w:color="808080"/>
+          <w:insideH w:val="single" w:sz="4" w:space="0" w:color="808080"/>
+          <w:insideV w:val="single" w:sz="4" w:space="0" w:color="808080"/>
+        </w:tblBorders>
+        <w:tblLayout w:type="fixed"/>
+      </w:tblPr>
+      <w:tblGrid>
+        <w:gridCol w:w="800"/>
+        <w:gridCol w:w="1300"/>
+        <w:gridCol w:w="2700"/>
+        <w:gridCol w:w="1700"/>
+        <w:gridCol w:w="2571"/>
+      </w:tblGrid>
+      <w:tr>
+        <w:tc>
+          <w:tcPr>
+            <w:tcW w:w="800" w:type="dxa"/>
+            <w:shd w:val="clear" w:color="auto" w:fill="D9E2F3"/>
+          </w:tcPr>
+          <w:p>
+            <w:pPr>
+              <w:spacing w:before="20" w:after="20" w:line="240" w:lineRule="auto"/>
+              <w:jc w:val="left"/>
+            </w:pPr>
+            <w:r>
+              <w:rPr>
+                <w:b/>
+                <w:bCs/>
+                <w:sz w:val="18"/>
+                <w:szCs w:val="18"/>
+              </w:rPr>
+              <w:t xml:space="preserve">Etapa</w:t>
+            </w:r>
+          </w:p>
+        </w:tc>
+        <w:tc>
+          <w:tcPr>
+            <w:tcW w:w="1300" w:type="dxa"/>
+            <w:shd w:val="clear" w:color="auto" w:fill="D9E2F3"/>
+          </w:tcPr>
+          <w:p>
+            <w:pPr>
+              <w:spacing w:before="20" w:after="20" w:line="240" w:lineRule="auto"/>
+              <w:jc w:val="left"/>
+            </w:pPr>
+            <w:r>
+              <w:rPr>
+                <w:b/>
+                <w:bCs/>
+                <w:sz w:val="18"/>
+                <w:szCs w:val="18"/>
+              </w:rPr>
+              <w:t xml:space="preserve">Período</w:t>
+            </w:r>
+          </w:p>
+        </w:tc>
+        <w:tc>
+          <w:tcPr>
+            <w:tcW w:w="2700" w:type="dxa"/>
+            <w:shd w:val="clear" w:color="auto" w:fill="D9E2F3"/>
+          </w:tcPr>
+          <w:p>
+            <w:pPr>
+              <w:spacing w:before="20" w:after="20" w:line="240" w:lineRule="auto"/>
+              <w:jc w:val="left"/>
+            </w:pPr>
+            <w:r>
+              <w:rPr>
+                <w:b/>
+                <w:bCs/>
+                <w:sz w:val="18"/>
+                <w:szCs w:val="18"/>
+              </w:rPr>
+              <w:t xml:space="preserve">Recurso</w:t>
+            </w:r>
+          </w:p>
+        </w:tc>
+        <w:tc>
+          <w:tcPr>
+            <w:tcW w:w="1700" w:type="dxa"/>
+            <w:shd w:val="clear" w:color="auto" w:fill="D9E2F3"/>
+          </w:tcPr>
+          <w:p>
+            <w:pPr>
+              <w:spacing w:before="20" w:after="20" w:line="240" w:lineRule="auto"/>
+              <w:jc w:val="left"/>
+            </w:pPr>
+            <w:r>
+              <w:rPr>
+                <w:b/>
+                <w:bCs/>
+                <w:sz w:val="18"/>
+                <w:szCs w:val="18"/>
+              </w:rPr>
+              <w:t xml:space="preserve">Frequência</w:t>
+            </w:r>
+          </w:p>
+        </w:tc>
+        <w:tc>
+          <w:tcPr>
+            <w:tcW w:w="2571" w:type="dxa"/>
+            <w:shd w:val="clear" w:color="auto" w:fill="D9E2F3"/>
+          </w:tcPr>
+          <w:p>
+            <w:pPr>
+              <w:spacing w:before="20" w:after="20" w:line="240" w:lineRule="auto"/>
+              <w:jc w:val="left"/>
+            </w:pPr>
+            <w:r>
+              <w:rPr>
+                <w:b/>
+                <w:bCs/>
+                <w:sz w:val="18"/>
+                <w:szCs w:val="18"/>
+              </w:rPr>
+              <w:t xml:space="preserve">Como foi feito</w:t>
+            </w:r>
+          </w:p>
+        </w:tc>
+      </w:tr>
+      <w:tr>
+        <w:tc>
+          <w:tcPr>
+            <w:tcW w:w="800" w:type="dxa"/>
+          </w:tcPr>
+          <w:p>
+            <w:pPr>
+              <w:spacing w:before="20" w:after="20" w:line="240" w:lineRule="auto"/>
+              <w:jc w:val="left"/>
+            </w:pPr>
+            <w:r>
+              <w:rPr>
+                <w:sz w:val="18"/>
+                <w:szCs w:val="18"/>
+              </w:rPr>
+              <w:t xml:space="preserve">1</w:t>
+            </w:r>
+          </w:p>
+        </w:tc>
+        <w:tc>
+          <w:tcPr>
+            <w:tcW w:w="1300" w:type="dxa"/>
+          </w:tcPr>
+          <w:p>
+            <w:pPr>
+              <w:spacing w:before="20" w:after="20" w:line="240" w:lineRule="auto"/>
+              <w:jc w:val="left"/>
+            </w:pPr>
+            <w:r>
+              <w:rPr>
+                <w:sz w:val="18"/>
+                <w:szCs w:val="18"/>
+              </w:rPr>
+              <w:t xml:space="preserve">Mês 1</w:t>
+            </w:r>
+          </w:p>
+        </w:tc>
+        <w:tc>
+          <w:tcPr>
+            <w:tcW w:w="2700" w:type="dxa"/>
+          </w:tcPr>
+          <w:p>
+            <w:pPr>
+              <w:spacing w:before="20" w:after="20" w:line="240" w:lineRule="auto"/>
+              <w:jc w:val="left"/>
+            </w:pPr>
+            <w:r>
+              <w:rPr>
+                <w:sz w:val="18"/>
+                <w:szCs w:val="18"/>
+              </w:rPr>
+              <w:t xml:space="preserve">Intradermoterapia (Mescla PHD)</w:t>
+            </w:r>
+          </w:p>
+        </w:tc>
+        <w:tc>
+          <w:tcPr>
+            <w:tcW w:w="1700" w:type="dxa"/>
+          </w:tcPr>
+          <w:p>
+            <w:pPr>
+              <w:spacing w:before="20" w:after="20" w:line="240" w:lineRule="auto"/>
+              <w:jc w:val="left"/>
+            </w:pPr>
+            <w:r>
+              <w:rPr>
+                <w:sz w:val="18"/>
+                <w:szCs w:val="18"/>
+              </w:rPr>
+              <w:t xml:space="preserve">1 vez por semana</w:t>
+            </w:r>
+          </w:p>
+        </w:tc>
+        <w:tc>
+          <w:tcPr>
+            <w:tcW w:w="2571" w:type="dxa"/>
+          </w:tcPr>
+          <w:p>
+            <w:pPr>
+              <w:spacing w:before="20" w:after="20" w:line="240" w:lineRule="auto"/>
+              <w:jc w:val="left"/>
+            </w:pPr>
+            <w:r>
+              <w:rPr>
+                <w:sz w:val="18"/>
+                <w:szCs w:val="18"/>
+              </w:rPr>
+              <w:t xml:space="preserve">técnica de pápula, agulha 30G, 2–4 mm, ~0,05–0,1 mL por ponto, pápulas a cada 2 cm</w:t>
+            </w:r>
+          </w:p>
+        </w:tc>
+      </w:tr>
+      <w:tr>
+        <w:tc>
+          <w:tcPr>
+            <w:tcW w:w="800" w:type="dxa"/>
+          </w:tcPr>
+          <w:p>
+            <w:pPr>
+              <w:spacing w:before="20" w:after="20" w:line="240" w:lineRule="auto"/>
+              <w:jc w:val="left"/>
+            </w:pPr>
+            <w:r>
+              <w:rPr>
+                <w:sz w:val="18"/>
+                <w:szCs w:val="18"/>
+              </w:rPr>
+              <w:t xml:space="preserve">2</w:t>
+            </w:r>
+          </w:p>
+        </w:tc>
+        <w:tc>
+          <w:tcPr>
+            <w:tcW w:w="1300" w:type="dxa"/>
+          </w:tcPr>
+          <w:p>
+            <w:pPr>
+              <w:spacing w:before="20" w:after="20" w:line="240" w:lineRule="auto"/>
+              <w:jc w:val="left"/>
+            </w:pPr>
+            <w:r>
+              <w:rPr>
+                <w:sz w:val="18"/>
+                <w:szCs w:val="18"/>
+              </w:rPr>
+              <w:t xml:space="preserve">A partir do mês 2</w:t>
+            </w:r>
+          </w:p>
+        </w:tc>
+        <w:tc>
+          <w:tcPr>
+            <w:tcW w:w="2700" w:type="dxa"/>
+          </w:tcPr>
+          <w:p>
+            <w:pPr>
+              <w:spacing w:before="20" w:after="20" w:line="240" w:lineRule="auto"/>
+              <w:jc w:val="left"/>
+            </w:pPr>
+            <w:r>
+              <w:rPr>
+                <w:sz w:val="18"/>
+                <w:szCs w:val="18"/>
+              </w:rPr>
+              <w:t xml:space="preserve">Fotobiomodulação (laser vermelho 655–660 nm, ~2 J/cm², ~20 min)</w:t>
+            </w:r>
+          </w:p>
+        </w:tc>
+        <w:tc>
+          <w:tcPr>
+            <w:tcW w:w="1700" w:type="dxa"/>
+          </w:tcPr>
+          <w:p>
+            <w:pPr>
+              <w:spacing w:before="20" w:after="20" w:line="240" w:lineRule="auto"/>
+              <w:jc w:val="left"/>
+            </w:pPr>
+            <w:r>
+              <w:rPr>
+                <w:sz w:val="18"/>
+                <w:szCs w:val="18"/>
+              </w:rPr>
+              <w:t xml:space="preserve">1 sessão a cada 15 dias</w:t>
+            </w:r>
+          </w:p>
+        </w:tc>
+        <w:tc>
+          <w:tcPr>
+            <w:tcW w:w="2571" w:type="dxa"/>
+          </w:tcPr>
+          <w:p>
+            <w:pPr>
+              <w:spacing w:before="20" w:after="20" w:line="240" w:lineRule="auto"/>
+              <w:jc w:val="left"/>
+            </w:pPr>
+            <w:r>
+              <w:rPr>
+                <w:sz w:val="18"/>
+                <w:szCs w:val="18"/>
+              </w:rPr>
+              <w:t xml:space="preserve">intercalada com a intradermoterapia</w:t>
+            </w:r>
+          </w:p>
+        </w:tc>
+      </w:tr>
+      <w:tr>
+        <w:tc>
+          <w:tcPr>
+            <w:tcW w:w="800" w:type="dxa"/>
+          </w:tcPr>
+          <w:p>
+            <w:pPr>
+              <w:spacing w:before="20" w:after="20" w:line="240" w:lineRule="auto"/>
+              <w:jc w:val="left"/>
+            </w:pPr>
+            <w:r>
+              <w:rPr>
+                <w:sz w:val="18"/>
+                <w:szCs w:val="18"/>
+              </w:rPr>
+              <w:t xml:space="preserve">2</w:t>
+            </w:r>
+          </w:p>
+        </w:tc>
+        <w:tc>
+          <w:tcPr>
+            <w:tcW w:w="1300" w:type="dxa"/>
+          </w:tcPr>
+          <w:p>
+            <w:pPr>
+              <w:spacing w:before="20" w:after="20" w:line="240" w:lineRule="auto"/>
+              <w:jc w:val="left"/>
+            </w:pPr>
+            <w:r>
+              <w:rPr>
+                <w:sz w:val="18"/>
+                <w:szCs w:val="18"/>
+              </w:rPr>
+              <w:t xml:space="preserve">A partir do mês 2</w:t>
+            </w:r>
+          </w:p>
+        </w:tc>
+        <w:tc>
+          <w:tcPr>
+            <w:tcW w:w="2700" w:type="dxa"/>
+          </w:tcPr>
+          <w:p>
+            <w:pPr>
+              <w:spacing w:before="20" w:after="20" w:line="240" w:lineRule="auto"/>
+              <w:jc w:val="left"/>
+            </w:pPr>
+            <w:r>
+              <w:rPr>
+                <w:sz w:val="18"/>
+                <w:szCs w:val="18"/>
+              </w:rPr>
+              <w:t xml:space="preserve">Intradermoterapia (mesma técnica)</w:t>
+            </w:r>
+          </w:p>
+        </w:tc>
+        <w:tc>
+          <w:tcPr>
+            <w:tcW w:w="1700" w:type="dxa"/>
+          </w:tcPr>
+          <w:p>
+            <w:pPr>
+              <w:spacing w:before="20" w:after="20" w:line="240" w:lineRule="auto"/>
+              <w:jc w:val="left"/>
+            </w:pPr>
+            <w:r>
+              <w:rPr>
+                <w:sz w:val="18"/>
+                <w:szCs w:val="18"/>
+              </w:rPr>
+              <w:t xml:space="preserve">1 sessão a cada 15 dias</w:t>
+            </w:r>
+          </w:p>
+        </w:tc>
+        <w:tc>
+          <w:tcPr>
+            <w:tcW w:w="2571" w:type="dxa"/>
+          </w:tcPr>
+          <w:p>
+            <w:pPr>
+              <w:spacing w:before="20" w:after="20" w:line="240" w:lineRule="auto"/>
+              <w:jc w:val="left"/>
+            </w:pPr>
+            <w:r>
+              <w:rPr>
+                <w:sz w:val="18"/>
+                <w:szCs w:val="18"/>
+              </w:rPr>
+              <w:t xml:space="preserve">intercalada com o laser</w:t>
+            </w:r>
+          </w:p>
+        </w:tc>
+      </w:tr>
+      <w:tr>
+        <w:tc>
+          <w:tcPr>
+            <w:tcW w:w="800" w:type="dxa"/>
+          </w:tcPr>
+          <w:p>
+            <w:pPr>
+              <w:spacing w:before="20" w:after="20" w:line="240" w:lineRule="auto"/>
+              <w:jc w:val="left"/>
+            </w:pPr>
+            <w:r>
+              <w:rPr>
+                <w:sz w:val="18"/>
+                <w:szCs w:val="18"/>
+              </w:rPr>
+              <w:t xml:space="preserve">Contínuo</w:t>
+            </w:r>
+          </w:p>
+        </w:tc>
+        <w:tc>
+          <w:tcPr>
+            <w:tcW w:w="1300" w:type="dxa"/>
+          </w:tcPr>
+          <w:p>
+            <w:pPr>
+              <w:spacing w:before="20" w:after="20" w:line="240" w:lineRule="auto"/>
+              <w:jc w:val="left"/>
+            </w:pPr>
+            <w:r>
+              <w:rPr>
+                <w:sz w:val="18"/>
+                <w:szCs w:val="18"/>
+              </w:rPr>
+              <w:t xml:space="preserve">Todo o período</w:t>
+            </w:r>
+          </w:p>
+        </w:tc>
+        <w:tc>
+          <w:tcPr>
+            <w:tcW w:w="2700" w:type="dxa"/>
+          </w:tcPr>
+          <w:p>
+            <w:pPr>
+              <w:spacing w:before="20" w:after="20" w:line="240" w:lineRule="auto"/>
+              <w:jc w:val="left"/>
+            </w:pPr>
+            <w:r>
+              <w:rPr>
+                <w:sz w:val="18"/>
+                <w:szCs w:val="18"/>
+              </w:rPr>
+              <w:t xml:space="preserve">Tônico Capilia Longa</w:t>
+            </w:r>
+          </w:p>
+        </w:tc>
+        <w:tc>
+          <w:tcPr>
+            <w:tcW w:w="1700" w:type="dxa"/>
+          </w:tcPr>
+          <w:p>
+            <w:pPr>
+              <w:spacing w:before="20" w:after="20" w:line="240" w:lineRule="auto"/>
+              <w:jc w:val="left"/>
+            </w:pPr>
+            <w:r>
+              <w:rPr>
+                <w:sz w:val="18"/>
+                <w:szCs w:val="18"/>
+              </w:rPr>
+              <w:t xml:space="preserve">diário, em casa</w:t>
+            </w:r>
+          </w:p>
+        </w:tc>
+        <w:tc>
+          <w:tcPr>
+            <w:tcW w:w="2571" w:type="dxa"/>
+          </w:tcPr>
+          <w:p>
+            <w:pPr>
+              <w:spacing w:before="20" w:after="20" w:line="240" w:lineRule="auto"/>
+              <w:jc w:val="left"/>
+            </w:pPr>
+            <w:r>
+              <w:rPr>
+                <w:sz w:val="18"/>
+                <w:szCs w:val="18"/>
+              </w:rPr>
+              <w:t xml:space="preserve">cuidado domiciliar</w:t>
+            </w:r>
+          </w:p>
+        </w:tc>
+      </w:tr>
+    </w:tbl>
+    <w:p>
+      <w:pPr>
+        <w:spacing w:before="40" w:after="60" w:line="240" w:lineRule="auto"/>
+        <w:jc w:val="left"/>
+      </w:pPr>
+      <w:r>
+        <w:rPr>
+          <w:i/>
+          <w:iCs/>
+        </w:rPr>
+        <w:t xml:space="preserve">Fonte: dados da pesquisa (2026).</w:t>
+      </w:r>
+    </w:p>
+    <w:p>
+      <w:pPr>
         <w:spacing w:line="240" w:lineRule="auto"/>
       </w:pPr>
     </w:p>
@@ -325,7 +858,7 @@
           <w:b/>
           <w:bCs/>
         </w:rPr>
-        <w:t xml:space="preserve">FUNDAMENTAÇÃO TEÓRICA E RESULTADOS PARCIAIS</w:t>
+        <w:t xml:space="preserve">FUNDAMENTAÇÃO TEÓRICA</w:t>
       </w:r>
     </w:p>
     <w:p>
@@ -391,7 +924,25 @@
       </w:pPr>
       <w:r>
         <w:rPr/>
-        <w:t xml:space="preserve">Dos resultados parciais, tem-se o seguinte percurso. A terapia iniciada no terceiro semestre, concebida como preparo da pele e centrada no home care, produziu redução satisfatória da hiperemia e da oleosidade, deixando o couro cabeludo equilibrado ao final da Fase 1. Esse resultado é coerente com a lógica de desinflamar antes de estimular: a fotobiomodulação atua sobre a microcirculação e o metabolismo celular do folículo, prolongando a fase anágena (Avci et al., 2014), e seu efeito depende de um leito cutâneo sem inflamação ativa.</w:t>
+        <w:t xml:space="preserve">Quanto aos recursos empregados, Yoon et al. (2020), em ensaio randomizado, duplo-cego e controlado por dispositivo simulado, obtiveram ganho de aproximadamente 41,9 fios/cm² com fotobiomodulação. A intradermoterapia, por sua vez, deposita os ativos diretamente na junção dermoepidérmica, contornando as barreiras de absorção gastrointestinal relevantes nesta paciente (Uzel et al., 2021; Aledani et al., 2024), e o restabelecimento da absorção de ferro, zinco e vitamina B12 favorece os substratos exigidos pela fase anágena (Guo; Katta, 2017). Como o protocolo combina modalidades, a literatura de terapia combinada indica benefício ao menos equivalente ao da monoterapia (Kaiser et al., 2022).</w:t>
+      </w:r>
+    </w:p>
+    <w:p>
+      <w:pPr>
+        <w:spacing w:line="240" w:lineRule="auto"/>
+      </w:pPr>
+    </w:p>
+    <w:p>
+      <w:pPr>
+        <w:spacing w:before="0" w:after="60" w:line="240" w:lineRule="auto"/>
+        <w:jc w:val="left"/>
+      </w:pPr>
+      <w:r>
+        <w:rPr>
+          <w:b/>
+          <w:bCs/>
+        </w:rPr>
+        <w:t xml:space="preserve">RESULTADOS</w:t>
       </w:r>
     </w:p>
     <w:p>
@@ -402,91 +953,7 @@
       </w:pPr>
       <w:r>
         <w:rPr/>
-        <w:t xml:space="preserve">Neste ano, entretanto, constatou-se piora do quadro: a tricoscopia não evidenciou o ganho de densidade previsto e a paciente relatou aumento da queda. A nova avaliação apontou higienização capilar insuficiente e uso irregular do tônico domiciliar — ou seja, falha na etapa de home care, e não no recurso empregado. Após reforço das orientações, revisão dos produtos e aumento da frequência de lavagem, somados ao apoio médico que melhorou o quadro gastrointestinal, registraram-se aumento da microcirculação e surgimento de novos fios nos espaçamentos das áreas anteriormente rarefeitas, o que motivou a extensão da série de sessões.</w:t>
-      </w:r>
-    </w:p>
-    <w:p>
-      <w:pPr>
-        <w:ind w:firstLine="851"/>
-        <w:spacing w:before="0" w:after="60" w:line="240" w:lineRule="auto"/>
-        <w:jc w:val="both"/>
-      </w:pPr>
-      <w:r>
-        <w:rPr/>
-        <w:t xml:space="preserve">A literatura oferece explicação plausível para o porquê da melhora observada nesse segundo momento. A higienização adequada remove o excesso de sebo e resíduos que sustentam o processo inflamatório perifolicular, condição necessária para que a fotobiomodulação exerça seu efeito trófico (Avci et al., 2014); Yoon et al. (2020), em ensaio randomizado, duplo-cego e controlado por dispositivo simulado, obtiveram ganho de aproximadamente 41,9 fios/cm². A intradermoterapia, por sua vez, deposita os ativos diretamente na junção dermoepidérmica, contornando as barreiras de absorção gastrointestinal relevantes nesta paciente (Uzel et al., 2021; Aledani et al., 2024). Em paralelo, a melhora gastrointestinal obtida com apoio médico tende a restabelecer a absorção de ferro, zinco e vitamina B12, substratos exigidos pela fase anágena (Guo; Katta, 2017). Por serem parciais, esses achados não podem ser atribuídos isoladamente a um único recurso, uma vez que o protocolo combinou três modalidades, e a literatura de terapia combinada indica benefício ao menos equivalente ao da monoterapia (Kaiser et al., 2022).</w:t>
-      </w:r>
-    </w:p>
-    <w:p>
-      <w:pPr>
-        <w:spacing w:line="240" w:lineRule="auto"/>
-      </w:pPr>
-    </w:p>
-    <w:p>
-      <w:pPr>
-        <w:spacing w:before="0" w:after="60" w:line="240" w:lineRule="auto"/>
-        <w:jc w:val="left"/>
-      </w:pPr>
-      <w:r>
-        <w:rPr>
-          <w:b/>
-          <w:bCs/>
-        </w:rPr>
-        <w:t xml:space="preserve">CONSIDERAÇÕES FINAIS</w:t>
-      </w:r>
-    </w:p>
-    <w:p>
-      <w:pPr>
-        <w:ind w:firstLine="851"/>
-        <w:spacing w:before="0" w:after="60" w:line="240" w:lineRule="auto"/>
-        <w:jc w:val="both"/>
-      </w:pPr>
-      <w:r>
-        <w:rPr/>
-        <w:t xml:space="preserve">O acompanhamento, ainda em andamento, permitiu observar até aqui que um protocolo estético estruturado em duas fases — desinflamação seguida de estímulo —, associando fotobiomodulação, intradermoterapia capilar e cuidado domiciliar, foi bem tolerado e acompanhou-se de melhora da condição do couro cabeludo e do surgimento de novos fios nas áreas rarefeitas.</w:t>
-      </w:r>
-    </w:p>
-    <w:p>
-      <w:pPr>
-        <w:ind w:firstLine="851"/>
-        <w:spacing w:before="0" w:after="60" w:line="240" w:lineRule="auto"/>
-        <w:jc w:val="both"/>
-      </w:pPr>
-      <w:r>
-        <w:rPr/>
-        <w:t xml:space="preserve">A adesão às orientações domiciliares constituiu o fator mais determinante da qualidade da resposta: o período de higienização inadequada e de uso irregular do tônico coincidiu com estagnação e piora percebida do quadro, enquanto a correção da conduta precedeu a retomada da evolução favorável. Isso sustenta a educação da paciente como componente do próprio protocolo.</w:t>
-      </w:r>
-    </w:p>
-    <w:p>
-      <w:pPr>
-        <w:ind w:firstLine="851"/>
-        <w:spacing w:before="0" w:after="60" w:line="240" w:lineRule="auto"/>
-        <w:jc w:val="both"/>
-      </w:pPr>
-      <w:r>
-        <w:rPr/>
-        <w:t xml:space="preserve">Quanto à relação entre saúde gastrointestinal e alopecia androgenética, o estudo permite afirmar que a infecção pregressa por </w:t>
-      </w:r>
-      <w:r>
-        <w:rPr>
-          <w:i/>
-          <w:iCs/>
-        </w:rPr>
-        <w:t xml:space="preserve">Helicobacter pylori</w:t>
-      </w:r>
-      <w:r>
-        <w:rPr/>
-        <w:t xml:space="preserve">, a gastrite crônica e seu tratamento configuram fatores sistêmicos associados, com plausibilidade mecanística ancorada na má absorção de micronutrientes, mas não constituem causa isolada nem determinante do quadro. Qualquer afirmação de causalidade direta extrapolaria a evidência disponível e o delineamento adotado.</w:t>
-      </w:r>
-    </w:p>
-    <w:p>
-      <w:pPr>
-        <w:ind w:firstLine="851"/>
-        <w:spacing w:before="0" w:after="60" w:line="240" w:lineRule="auto"/>
-        <w:jc w:val="both"/>
-      </w:pPr>
-      <w:r>
-        <w:rPr/>
-        <w:t xml:space="preserve">Como limitações, registram-se o delineamento de caso único, a ausência de grupo controle, o uso combinado de recursos que impede isolar a contribuição de cada um e a avaliação predominantemente qualitativa da evolução. Sugere-se que estudos futuros, com amostras maiores e avaliação laboratorial seriada de ferritina, vitamina B12 e zinco, investiguem de modo controlado a interface entre saúde gastrointestinal e progressão da alopecia androgenética feminina.</w:t>
+        <w:t xml:space="preserve">A pesquisa está em andamento e os resultados ainda não foram analisados, pois dependem do registro fotográfico final (depois), a ser obtido nas mesmas condições do registro inicial, e da reavaliação tricoscópica. Até lá, não é possível afirmar se houve ou não resposta ao protocolo.</w:t>
       </w:r>
     </w:p>
     <w:p>

</xml_diff>